<commit_message>
Stilmittel stehen in der Brand Voice: Analyse legt die Zeile an, Workshop-Unterlagen mit Fragen zu Schreibweise und Stilmitteln, Onboarding-Frage entfernt
Co-Authored-By: Claude Sonnet 5.5 <noreply@anthropic.com>
</commit_message>
<xml_diff>
--- a/rhetoriq-app/server/templates/workshop/RhetorIQ_Workshop_Erfassungsbogen.docx
+++ b/rhetoriq-app/server/templates/workshop/RhetorIQ_Workshop_Erfassungsbogen.docx
@@ -725,6 +725,588 @@
       </w:pPr>
       <w:r>
         <w:t xml:space="preserve"/>
+      </w:r>
+    </w:p>
+    <w:p>
+      <w:pPr>
+        <w:pStyle w:val="Heading2"/>
+      </w:pPr>
+      <w:r>
+        <w:t xml:space="preserve">B6 — Schreibweise und Stilmittel (Übung 9)</w:t>
+      </w:r>
+    </w:p>
+    <w:p>
+      <w:pPr>
+        <w:spacing w:after="140"/>
+      </w:pPr>
+      <w:r>
+        <w:t xml:space="preserve">Jede Frage mit einem Beispiel aus den echten Texten beantworten. Die Antworten gelten für die ganze Zusammenarbeit und werden in der Brand Voice festgehalten.</w:t>
+      </w:r>
+    </w:p>
+    <w:p>
+      <w:pPr>
+        <w:spacing w:after="40" w:before="100"/>
+      </w:pPr>
+      <w:r>
+        <w:rPr>
+          <w:b/>
+          <w:bCs/>
+        </w:rPr>
+        <w:t xml:space="preserve">Anrede</w:t>
+      </w:r>
+    </w:p>
+    <w:p>
+      <w:pPr>
+        <w:spacing w:after="60"/>
+      </w:pPr>
+      <w:r>
+        <w:rPr>
+          <w:color w:val="5F6B63"/>
+          <w:sz w:val="19"/>
+          <w:szCs w:val="19"/>
+        </w:rPr>
+        <w:t xml:space="preserve">Sie, du oder je nach Textart gemischt? Wer wird wie angesprochen: Kundschaft, Mitarbeitende, Medien, Partner?</w:t>
+      </w:r>
+    </w:p>
+    <w:p>
+      <w:pPr>
+        <w:pBdr>
+          <w:bottom w:val="single" w:color="D1D5D3" w:sz="2"/>
+        </w:pBdr>
+        <w:spacing w:after="120"/>
+      </w:pPr>
+      <w:r>
+        <w:t xml:space="preserve"/>
+      </w:r>
+    </w:p>
+    <w:p>
+      <w:pPr>
+        <w:pBdr>
+          <w:bottom w:val="single" w:color="D1D5D3" w:sz="2"/>
+        </w:pBdr>
+        <w:spacing w:after="120"/>
+      </w:pPr>
+      <w:r>
+        <w:t xml:space="preserve"/>
+      </w:r>
+    </w:p>
+    <w:p>
+      <w:pPr>
+        <w:spacing w:after="40" w:before="100"/>
+      </w:pPr>
+      <w:r>
+        <w:rPr>
+          <w:b/>
+          <w:bCs/>
+        </w:rPr>
+        <w:t xml:space="preserve">Gegenüberstellungen</w:t>
+      </w:r>
+    </w:p>
+    <w:p>
+      <w:pPr>
+        <w:spacing w:after="60"/>
+      </w:pPr>
+      <w:r>
+        <w:rPr>
+          <w:color w:val="5F6B63"/>
+          <w:sz w:val="19"/>
+          <w:szCs w:val="19"/>
+        </w:rPr>
+        <w:t xml:space="preserve">Schreibt die Marke bewusst mit «nicht X, sondern Y»? Ein Beispiel aus den eigenen Texten zeigen lassen. Gehört das zum Stil oder hat es sich eingeschlichen?</w:t>
+      </w:r>
+    </w:p>
+    <w:p>
+      <w:pPr>
+        <w:pBdr>
+          <w:bottom w:val="single" w:color="D1D5D3" w:sz="2"/>
+        </w:pBdr>
+        <w:spacing w:after="120"/>
+      </w:pPr>
+      <w:r>
+        <w:t xml:space="preserve"/>
+      </w:r>
+    </w:p>
+    <w:p>
+      <w:pPr>
+        <w:pBdr>
+          <w:bottom w:val="single" w:color="D1D5D3" w:sz="2"/>
+        </w:pBdr>
+        <w:spacing w:after="120"/>
+      </w:pPr>
+      <w:r>
+        <w:t xml:space="preserve"/>
+      </w:r>
+    </w:p>
+    <w:p>
+      <w:pPr>
+        <w:spacing w:after="40" w:before="100"/>
+      </w:pPr>
+      <w:r>
+        <w:rPr>
+          <w:b/>
+          <w:bCs/>
+        </w:rPr>
+        <w:t xml:space="preserve">Dreierketten</w:t>
+      </w:r>
+    </w:p>
+    <w:p>
+      <w:pPr>
+        <w:spacing w:after="60"/>
+      </w:pPr>
+      <w:r>
+        <w:rPr>
+          <w:color w:val="5F6B63"/>
+          <w:sz w:val="19"/>
+          <w:szCs w:val="19"/>
+        </w:rPr>
+        <w:t xml:space="preserve">Werden Aufzählungen wie «klar, schnell und zuverlässig» bewusst als Rhythmus eingesetzt? Gehört das zum Stil oder soll es vermieden werden?</w:t>
+      </w:r>
+    </w:p>
+    <w:p>
+      <w:pPr>
+        <w:pBdr>
+          <w:bottom w:val="single" w:color="D1D5D3" w:sz="2"/>
+        </w:pBdr>
+        <w:spacing w:after="120"/>
+      </w:pPr>
+      <w:r>
+        <w:t xml:space="preserve"/>
+      </w:r>
+    </w:p>
+    <w:p>
+      <w:pPr>
+        <w:pBdr>
+          <w:bottom w:val="single" w:color="D1D5D3" w:sz="2"/>
+        </w:pBdr>
+        <w:spacing w:after="120"/>
+      </w:pPr>
+      <w:r>
+        <w:t xml:space="preserve"/>
+      </w:r>
+    </w:p>
+    <w:p>
+      <w:pPr>
+        <w:spacing w:after="40" w:before="100"/>
+      </w:pPr>
+      <w:r>
+        <w:rPr>
+          <w:b/>
+          <w:bCs/>
+        </w:rPr>
+        <w:t xml:space="preserve">Satzlänge und Absätze</w:t>
+      </w:r>
+    </w:p>
+    <w:p>
+      <w:pPr>
+        <w:spacing w:after="60"/>
+      </w:pPr>
+      <w:r>
+        <w:rPr>
+          <w:color w:val="5F6B63"/>
+          <w:sz w:val="19"/>
+          <w:szCs w:val="19"/>
+        </w:rPr>
+        <w:t xml:space="preserve">Eher kurze, knappe Sätze oder längere, erklärende? Wie lang dürfen Absätze sein? Gibt es einen typischen Einstieg?</w:t>
+      </w:r>
+    </w:p>
+    <w:p>
+      <w:pPr>
+        <w:pBdr>
+          <w:bottom w:val="single" w:color="D1D5D3" w:sz="2"/>
+        </w:pBdr>
+        <w:spacing w:after="120"/>
+      </w:pPr>
+      <w:r>
+        <w:t xml:space="preserve"/>
+      </w:r>
+    </w:p>
+    <w:p>
+      <w:pPr>
+        <w:pBdr>
+          <w:bottom w:val="single" w:color="D1D5D3" w:sz="2"/>
+        </w:pBdr>
+        <w:spacing w:after="120"/>
+      </w:pPr>
+      <w:r>
+        <w:t xml:space="preserve"/>
+      </w:r>
+    </w:p>
+    <w:p>
+      <w:pPr>
+        <w:spacing w:after="40" w:before="100"/>
+      </w:pPr>
+      <w:r>
+        <w:rPr>
+          <w:b/>
+          <w:bCs/>
+        </w:rPr>
+        <w:t xml:space="preserve">Hausvokabular</w:t>
+      </w:r>
+    </w:p>
+    <w:p>
+      <w:pPr>
+        <w:spacing w:after="60"/>
+      </w:pPr>
+      <w:r>
+        <w:rPr>
+          <w:color w:val="5F6B63"/>
+          <w:sz w:val="19"/>
+          <w:szCs w:val="19"/>
+        </w:rPr>
+        <w:t xml:space="preserve">Welche Wörter und Begriffe verwendet die Marke gern und durchgehend (Produktnamen, Bezeichnungen für Kundschaft, Eigenwörter)?</w:t>
+      </w:r>
+    </w:p>
+    <w:p>
+      <w:pPr>
+        <w:pBdr>
+          <w:bottom w:val="single" w:color="D1D5D3" w:sz="2"/>
+        </w:pBdr>
+        <w:spacing w:after="120"/>
+      </w:pPr>
+      <w:r>
+        <w:t xml:space="preserve"/>
+      </w:r>
+    </w:p>
+    <w:p>
+      <w:pPr>
+        <w:pBdr>
+          <w:bottom w:val="single" w:color="D1D5D3" w:sz="2"/>
+        </w:pBdr>
+        <w:spacing w:after="120"/>
+      </w:pPr>
+      <w:r>
+        <w:t xml:space="preserve"/>
+      </w:r>
+    </w:p>
+    <w:p>
+      <w:pPr>
+        <w:spacing w:after="40" w:before="100"/>
+      </w:pPr>
+      <w:r>
+        <w:rPr>
+          <w:b/>
+          <w:bCs/>
+        </w:rPr>
+        <w:t xml:space="preserve">Wörter und Wendungen, die nie vorkommen</w:t>
+      </w:r>
+    </w:p>
+    <w:p>
+      <w:pPr>
+        <w:spacing w:after="60"/>
+      </w:pPr>
+      <w:r>
+        <w:rPr>
+          <w:color w:val="5F6B63"/>
+          <w:sz w:val="19"/>
+          <w:szCs w:val="19"/>
+        </w:rPr>
+        <w:t xml:space="preserve">Welche Formulierungen passen nicht zur Marke (zu förmlich, zu werblich, Modewörter)? Eine Verbotsliste in den Worten des Kunden.</w:t>
+      </w:r>
+    </w:p>
+    <w:p>
+      <w:pPr>
+        <w:pBdr>
+          <w:bottom w:val="single" w:color="D1D5D3" w:sz="2"/>
+        </w:pBdr>
+        <w:spacing w:after="120"/>
+      </w:pPr>
+      <w:r>
+        <w:t xml:space="preserve"/>
+      </w:r>
+    </w:p>
+    <w:p>
+      <w:pPr>
+        <w:pBdr>
+          <w:bottom w:val="single" w:color="D1D5D3" w:sz="2"/>
+        </w:pBdr>
+        <w:spacing w:after="120"/>
+      </w:pPr>
+      <w:r>
+        <w:t xml:space="preserve"/>
+      </w:r>
+    </w:p>
+    <w:p>
+      <w:pPr>
+        <w:spacing w:after="40" w:before="100"/>
+      </w:pPr>
+      <w:r>
+        <w:rPr>
+          <w:b/>
+          <w:bCs/>
+        </w:rPr>
+        <w:t xml:space="preserve">Fachbegriffe und Anglizismen</w:t>
+      </w:r>
+    </w:p>
+    <w:p>
+      <w:pPr>
+        <w:spacing w:after="60"/>
+      </w:pPr>
+      <w:r>
+        <w:rPr>
+          <w:color w:val="5F6B63"/>
+          <w:sz w:val="19"/>
+          <w:szCs w:val="19"/>
+        </w:rPr>
+        <w:t xml:space="preserve">Deutsch oder Englisch? Welche Fachbegriffe sind erwünscht, welche müssen erklärt werden?</w:t>
+      </w:r>
+    </w:p>
+    <w:p>
+      <w:pPr>
+        <w:pBdr>
+          <w:bottom w:val="single" w:color="D1D5D3" w:sz="2"/>
+        </w:pBdr>
+        <w:spacing w:after="120"/>
+      </w:pPr>
+      <w:r>
+        <w:t xml:space="preserve"/>
+      </w:r>
+    </w:p>
+    <w:p>
+      <w:pPr>
+        <w:pBdr>
+          <w:bottom w:val="single" w:color="D1D5D3" w:sz="2"/>
+        </w:pBdr>
+        <w:spacing w:after="120"/>
+      </w:pPr>
+      <w:r>
+        <w:t xml:space="preserve"/>
+      </w:r>
+    </w:p>
+    <w:p>
+      <w:pPr>
+        <w:spacing w:after="40" w:before="100"/>
+      </w:pPr>
+      <w:r>
+        <w:rPr>
+          <w:b/>
+          <w:bCs/>
+        </w:rPr>
+        <w:t xml:space="preserve">Humor, Ironie, Ausrufezeichen, Emojis</w:t>
+      </w:r>
+    </w:p>
+    <w:p>
+      <w:pPr>
+        <w:spacing w:after="60"/>
+      </w:pPr>
+      <w:r>
+        <w:rPr>
+          <w:color w:val="5F6B63"/>
+          <w:sz w:val="19"/>
+          <w:szCs w:val="19"/>
+        </w:rPr>
+        <w:t xml:space="preserve">Was ist üblich, was nie? In welchen Textarten?</w:t>
+      </w:r>
+    </w:p>
+    <w:p>
+      <w:pPr>
+        <w:pBdr>
+          <w:bottom w:val="single" w:color="D1D5D3" w:sz="2"/>
+        </w:pBdr>
+        <w:spacing w:after="120"/>
+      </w:pPr>
+      <w:r>
+        <w:t xml:space="preserve"/>
+      </w:r>
+    </w:p>
+    <w:p>
+      <w:pPr>
+        <w:pBdr>
+          <w:bottom w:val="single" w:color="D1D5D3" w:sz="2"/>
+        </w:pBdr>
+        <w:spacing w:after="120"/>
+      </w:pPr>
+      <w:r>
+        <w:t xml:space="preserve"/>
+      </w:r>
+    </w:p>
+    <w:p>
+      <w:pPr>
+        <w:spacing w:after="40" w:before="100"/>
+      </w:pPr>
+      <w:r>
+        <w:rPr>
+          <w:b/>
+          <w:bCs/>
+        </w:rPr>
+        <w:t xml:space="preserve">Schreibweise</w:t>
+      </w:r>
+    </w:p>
+    <w:p>
+      <w:pPr>
+        <w:spacing w:after="60"/>
+      </w:pPr>
+      <w:r>
+        <w:rPr>
+          <w:color w:val="5F6B63"/>
+          <w:sz w:val="19"/>
+          <w:szCs w:val="19"/>
+        </w:rPr>
+        <w:t xml:space="preserve">Schweizer Rechtschreibung (ss statt ß) ist Standard. Gendern: nein, mit Paarform, neutral formuliert? Zahlen, Datum, Währung?</w:t>
+      </w:r>
+    </w:p>
+    <w:p>
+      <w:pPr>
+        <w:pBdr>
+          <w:bottom w:val="single" w:color="D1D5D3" w:sz="2"/>
+        </w:pBdr>
+        <w:spacing w:after="120"/>
+      </w:pPr>
+      <w:r>
+        <w:t xml:space="preserve"/>
+      </w:r>
+    </w:p>
+    <w:p>
+      <w:pPr>
+        <w:pBdr>
+          <w:bottom w:val="single" w:color="D1D5D3" w:sz="2"/>
+        </w:pBdr>
+        <w:spacing w:after="120"/>
+      </w:pPr>
+      <w:r>
+        <w:t xml:space="preserve"/>
+      </w:r>
+    </w:p>
+    <w:p>
+      <w:pPr>
+        <w:spacing w:after="40" w:before="100"/>
+      </w:pPr>
+      <w:r>
+        <w:rPr>
+          <w:b/>
+          <w:bCs/>
+        </w:rPr>
+        <w:t xml:space="preserve">Feste Formeln</w:t>
+      </w:r>
+    </w:p>
+    <w:p>
+      <w:pPr>
+        <w:spacing w:after="60"/>
+      </w:pPr>
+      <w:r>
+        <w:rPr>
+          <w:color w:val="5F6B63"/>
+          <w:sz w:val="19"/>
+          <w:szCs w:val="19"/>
+        </w:rPr>
+        <w:t xml:space="preserve">Betreff, Einstiegssatz, Grussformel, Signatur: gibt es Vorgaben, die immer gelten?</w:t>
+      </w:r>
+    </w:p>
+    <w:p>
+      <w:pPr>
+        <w:pBdr>
+          <w:bottom w:val="single" w:color="D1D5D3" w:sz="2"/>
+        </w:pBdr>
+        <w:spacing w:after="120"/>
+      </w:pPr>
+      <w:r>
+        <w:t xml:space="preserve"/>
+      </w:r>
+    </w:p>
+    <w:p>
+      <w:pPr>
+        <w:pBdr>
+          <w:bottom w:val="single" w:color="D1D5D3" w:sz="2"/>
+        </w:pBdr>
+        <w:spacing w:after="120"/>
+      </w:pPr>
+      <w:r>
+        <w:t xml:space="preserve"/>
+      </w:r>
+    </w:p>
+    <w:p>
+      <w:pPr>
+        <w:spacing w:after="40" w:before="100"/>
+      </w:pPr>
+      <w:r>
+        <w:rPr>
+          <w:b/>
+          <w:bCs/>
+        </w:rPr>
+        <w:t xml:space="preserve">Rote Linien</w:t>
+      </w:r>
+    </w:p>
+    <w:p>
+      <w:pPr>
+        <w:spacing w:after="60"/>
+      </w:pPr>
+      <w:r>
+        <w:rPr>
+          <w:color w:val="5F6B63"/>
+          <w:sz w:val="19"/>
+          <w:szCs w:val="19"/>
+        </w:rPr>
+        <w:t xml:space="preserve">Themen, Aussagen oder Versprechen, die nie vorkommen dürfen (rechtlich, politisch, strategisch).</w:t>
+      </w:r>
+    </w:p>
+    <w:p>
+      <w:pPr>
+        <w:pBdr>
+          <w:bottom w:val="single" w:color="D1D5D3" w:sz="2"/>
+        </w:pBdr>
+        <w:spacing w:after="120"/>
+      </w:pPr>
+      <w:r>
+        <w:t xml:space="preserve"/>
+      </w:r>
+    </w:p>
+    <w:p>
+      <w:pPr>
+        <w:pBdr>
+          <w:bottom w:val="single" w:color="D1D5D3" w:sz="2"/>
+        </w:pBdr>
+        <w:spacing w:after="120"/>
+      </w:pPr>
+      <w:r>
+        <w:t xml:space="preserve"/>
+      </w:r>
+    </w:p>
+    <w:p>
+      <w:pPr>
+        <w:spacing w:after="40" w:before="100"/>
+      </w:pPr>
+      <w:r>
+        <w:rPr>
+          <w:b/>
+          <w:bCs/>
+        </w:rPr>
+        <w:t xml:space="preserve">Stilmittel der Marke (ankreuzen)</w:t>
+      </w:r>
+    </w:p>
+    <w:p>
+      <w:pPr>
+        <w:spacing w:after="60"/>
+      </w:pPr>
+      <w:r>
+        <w:t xml:space="preserve">[ ] Gegenüberstellungen «nicht X, sondern Y» sind Teil des Stils und erlaubt</w:t>
+      </w:r>
+    </w:p>
+    <w:p>
+      <w:pPr>
+        <w:spacing w:after="60"/>
+      </w:pPr>
+      <w:r>
+        <w:t xml:space="preserve">[ ] Dreierketten sind Teil des Stils und erlaubt</w:t>
+      </w:r>
+    </w:p>
+    <w:p>
+      <w:pPr>
+        <w:spacing w:after="60"/>
+      </w:pPr>
+      <w:r>
+        <w:t xml:space="preserve">[ ] Keines davon: streng nach den Standardregeln (Normalfall)</w:t>
+      </w:r>
+    </w:p>
+    <w:p>
+      <w:pPr>
+        <w:spacing w:after="140" w:before="60"/>
+      </w:pPr>
+      <w:r>
+        <w:rPr>
+          <w:i/>
+          <w:iCs/>
+          <w:color w:val="5F6B63"/>
+        </w:rPr>
+        <w:t xml:space="preserve">Gedankenstriche, Floskeln, ß und Markdown sind immer ausgeschlossen und werden nicht abgefragt.</w:t>
       </w:r>
     </w:p>
     <w:p>
@@ -780,6 +1362,19 @@
       </w:pPr>
       <w:r>
         <w:t xml:space="preserve">Teil B vollständig und unverändert in das Feld für die Quelltexte einfügen — B1 bis B5 einfach hintereinander, mit einer Leerzeile getrennt. Keine Kürzung, keine Glättung.</w:t>
+      </w:r>
+    </w:p>
+    <w:p>
+      <w:pPr>
+        <w:pStyle w:val="ListParagraph"/>
+        <w:numPr>
+          <w:ilvl w:val="0"/>
+          <w:numId w:val="2"/>
+        </w:numPr>
+        <w:spacing w:after="70"/>
+      </w:pPr>
+      <w:r>
+        <w:t xml:space="preserve">B6 gehört zum Rohmaterial in Teil B und wird mit eingefügt. Die Brand-Voice-Analyse hält die Stilmittel (Gegenüberstellungen, Dreierketten) selbst in der Brand Voice fest, in einer Zeile «Stilmittel erlaubt: ...». Beim Gegenlesen prüfen, ob diese Zeile zu den Antworten aus B6 passt. Ohne belegte Stilmittel lautet sie «keine».</w:t>
       </w:r>
     </w:p>
     <w:p>

</xml_diff>

<commit_message>
Workshop-Unterlagen: Stilregeln der Marke als Checkliste mit Stil-Matrix je Textart (Erfassungsbogen B6, Leitfaden Übung 9)
Co-Authored-By: Claude Sonnet 5.5 <noreply@anthropic.com>
</commit_message>
<xml_diff>
--- a/rhetoriq-app/server/templates/workshop/RhetorIQ_Workshop_Erfassungsbogen.docx
+++ b/rhetoriq-app/server/templates/workshop/RhetorIQ_Workshop_Erfassungsbogen.docx
@@ -732,7 +732,7 @@
         <w:pStyle w:val="Heading2"/>
       </w:pPr>
       <w:r>
-        <w:t xml:space="preserve">B6 — Schreibweise und Stilmittel (Übung 9)</w:t>
+        <w:t xml:space="preserve">B6 — Stilregeln der Marke (Übung 9)</w:t>
       </w:r>
     </w:p>
     <w:p>
@@ -740,19 +740,27 @@
         <w:spacing w:after="140"/>
       </w:pPr>
       <w:r>
-        <w:t xml:space="preserve">Jede Frage mit einem Beispiel aus den echten Texten beantworten. Die Antworten gelten für die ganze Zusammenarbeit und werden in der Brand Voice festgehalten.</w:t>
-      </w:r>
-    </w:p>
-    <w:p>
-      <w:pPr>
-        <w:spacing w:after="40" w:before="100"/>
+        <w:t xml:space="preserve">Diese Checkliste geht ihr im Workshop gemeinsam durch. Was der Kunde nicht sofort weiss, wird aus seinen Texten und dem Gespräch abgeleitet: Welche Muster kommen vor, was klingt richtig? Zu jedem Punkt vermerken, woher die Antwort stammt. Gedankenstriche, Floskeln, ß und Markdown sind immer ausgeschlossen und werden nicht abgefragt.</w:t>
+      </w:r>
+    </w:p>
+    <w:p>
+      <w:pPr>
+        <w:spacing w:after="40" w:before="140"/>
       </w:pPr>
       <w:r>
         <w:rPr>
           <w:b/>
           <w:bCs/>
         </w:rPr>
-        <w:t xml:space="preserve">Anrede</w:t>
+        <w:t xml:space="preserve">1. Anrede</w:t>
+      </w:r>
+    </w:p>
+    <w:p>
+      <w:pPr>
+        <w:spacing w:after="50"/>
+      </w:pPr>
+      <w:r>
+        <w:t xml:space="preserve">[ ] Sie    [ ] Du    [ ] je nach Textart (in der Matrix unten eintragen)</w:t>
       </w:r>
     </w:p>
     <w:p>
@@ -765,41 +773,46 @@
           <w:sz w:val="19"/>
           <w:szCs w:val="19"/>
         </w:rPr>
-        <w:t xml:space="preserve">Sie, du oder je nach Textart gemischt? Wer wird wie angesprochen: Kundschaft, Mitarbeitende, Medien, Partner?</w:t>
-      </w:r>
-    </w:p>
-    <w:p>
-      <w:pPr>
-        <w:pBdr>
-          <w:bottom w:val="single" w:color="D1D5D3" w:sz="2"/>
-        </w:pBdr>
-        <w:spacing w:after="120"/>
-      </w:pPr>
-      <w:r>
-        <w:t xml:space="preserve"/>
-      </w:r>
-    </w:p>
-    <w:p>
-      <w:pPr>
-        <w:pBdr>
-          <w:bottom w:val="single" w:color="D1D5D3" w:sz="2"/>
-        </w:pBdr>
-        <w:spacing w:after="120"/>
-      </w:pPr>
-      <w:r>
-        <w:t xml:space="preserve"/>
-      </w:r>
-    </w:p>
-    <w:p>
-      <w:pPr>
-        <w:spacing w:after="40" w:before="100"/>
+        <w:t xml:space="preserve">Wer wird wie angesprochen: Kundschaft B2B, Kundschaft B2C, Mitarbeitende, Medien, Partner? Wer spricht in der Ich-Form (zum Beispiel nur die Geschäftsleitung in persönlichen Formaten)?</w:t>
+      </w:r>
+    </w:p>
+    <w:p>
+      <w:pPr>
+        <w:pBdr>
+          <w:bottom w:val="single" w:color="D1D5D3" w:sz="2"/>
+        </w:pBdr>
+        <w:spacing w:after="120"/>
+      </w:pPr>
+      <w:r>
+        <w:t xml:space="preserve"/>
+      </w:r>
+    </w:p>
+    <w:p>
+      <w:pPr>
+        <w:spacing w:after="50"/>
+      </w:pPr>
+      <w:r>
+        <w:t xml:space="preserve">Quelle:  [ ] im Workshop besprochen    [ ] aus dem Gespräch oder den Texten abgeleitet</w:t>
+      </w:r>
+    </w:p>
+    <w:p>
+      <w:pPr>
+        <w:spacing w:after="40" w:before="140"/>
       </w:pPr>
       <w:r>
         <w:rPr>
           <w:b/>
           <w:bCs/>
         </w:rPr>
-        <w:t xml:space="preserve">Gegenüberstellungen</w:t>
+        <w:t xml:space="preserve">2. Satzlänge und Absätze</w:t>
+      </w:r>
+    </w:p>
+    <w:p>
+      <w:pPr>
+        <w:spacing w:after="50"/>
+      </w:pPr>
+      <w:r>
+        <w:t xml:space="preserve">Höchstens ____ Wörter pro Satz (B2B) und ____ (B2C). Absätze: [ ] kurz  [ ] mittel  [ ] lang</w:t>
       </w:r>
     </w:p>
     <w:p>
@@ -812,41 +825,46 @@
           <w:sz w:val="19"/>
           <w:szCs w:val="19"/>
         </w:rPr>
-        <w:t xml:space="preserve">Schreibt die Marke bewusst mit «nicht X, sondern Y»? Ein Beispiel aus den eigenen Texten zeigen lassen. Gehört das zum Stil oder hat es sich eingeschlichen?</w:t>
-      </w:r>
-    </w:p>
-    <w:p>
-      <w:pPr>
-        <w:pBdr>
-          <w:bottom w:val="single" w:color="D1D5D3" w:sz="2"/>
-        </w:pBdr>
-        <w:spacing w:after="120"/>
-      </w:pPr>
-      <w:r>
-        <w:t xml:space="preserve"/>
-      </w:r>
-    </w:p>
-    <w:p>
-      <w:pPr>
-        <w:pBdr>
-          <w:bottom w:val="single" w:color="D1D5D3" w:sz="2"/>
-        </w:pBdr>
-        <w:spacing w:after="120"/>
-      </w:pPr>
-      <w:r>
-        <w:t xml:space="preserve"/>
-      </w:r>
-    </w:p>
-    <w:p>
-      <w:pPr>
-        <w:spacing w:after="40" w:before="100"/>
+        <w:t xml:space="preserve">Hilfsfrage: Welche Sätze aus den eigenen Texten fühlen sich richtig an, welche zu lang?</w:t>
+      </w:r>
+    </w:p>
+    <w:p>
+      <w:pPr>
+        <w:pBdr>
+          <w:bottom w:val="single" w:color="D1D5D3" w:sz="2"/>
+        </w:pBdr>
+        <w:spacing w:after="120"/>
+      </w:pPr>
+      <w:r>
+        <w:t xml:space="preserve"/>
+      </w:r>
+    </w:p>
+    <w:p>
+      <w:pPr>
+        <w:spacing w:after="50"/>
+      </w:pPr>
+      <w:r>
+        <w:t xml:space="preserve">Quelle:  [ ] im Workshop besprochen    [ ] aus dem Gespräch oder den Texten abgeleitet</w:t>
+      </w:r>
+    </w:p>
+    <w:p>
+      <w:pPr>
+        <w:spacing w:after="40" w:before="140"/>
       </w:pPr>
       <w:r>
         <w:rPr>
           <w:b/>
           <w:bCs/>
         </w:rPr>
-        <w:t xml:space="preserve">Dreierketten</w:t>
+        <w:t xml:space="preserve">3. Wortverbote und Ausnahmen</w:t>
+      </w:r>
+    </w:p>
+    <w:p>
+      <w:pPr>
+        <w:spacing w:after="50"/>
+      </w:pPr>
+      <w:r>
+        <w:t xml:space="preserve">Anglizismen: [ ] erlaubt  [ ] nur wenn es kein deutsches Wort gibt  [ ] ausgeschlossen</w:t>
       </w:r>
     </w:p>
     <w:p>
@@ -859,41 +877,46 @@
           <w:sz w:val="19"/>
           <w:szCs w:val="19"/>
         </w:rPr>
-        <w:t xml:space="preserve">Werden Aufzählungen wie «klar, schnell und zuverlässig» bewusst als Rhythmus eingesetzt? Gehört das zum Stil oder soll es vermieden werden?</w:t>
-      </w:r>
-    </w:p>
-    <w:p>
-      <w:pPr>
-        <w:pBdr>
-          <w:bottom w:val="single" w:color="D1D5D3" w:sz="2"/>
-        </w:pBdr>
-        <w:spacing w:after="120"/>
-      </w:pPr>
-      <w:r>
-        <w:t xml:space="preserve"/>
-      </w:r>
-    </w:p>
-    <w:p>
-      <w:pPr>
-        <w:pBdr>
-          <w:bottom w:val="single" w:color="D1D5D3" w:sz="2"/>
-        </w:pBdr>
-        <w:spacing w:after="120"/>
-      </w:pPr>
-      <w:r>
-        <w:t xml:space="preserve"/>
-      </w:r>
-    </w:p>
-    <w:p>
-      <w:pPr>
-        <w:spacing w:after="40" w:before="100"/>
+        <w:t xml:space="preserve">Ausnahmen gleich mitklären: Slogans, Claims, Eigen- und Produktnamen, Titel, Zitate (welche genau?). Weitere Wörter, die nie vorkommen. Pflichtbegriffe, die immer so heissen müssen (zum Beispiel Propangas statt LPG).</w:t>
+      </w:r>
+    </w:p>
+    <w:p>
+      <w:pPr>
+        <w:pBdr>
+          <w:bottom w:val="single" w:color="D1D5D3" w:sz="2"/>
+        </w:pBdr>
+        <w:spacing w:after="120"/>
+      </w:pPr>
+      <w:r>
+        <w:t xml:space="preserve"/>
+      </w:r>
+    </w:p>
+    <w:p>
+      <w:pPr>
+        <w:spacing w:after="50"/>
+      </w:pPr>
+      <w:r>
+        <w:t xml:space="preserve">Quelle:  [ ] im Workshop besprochen    [ ] aus dem Gespräch oder den Texten abgeleitet</w:t>
+      </w:r>
+    </w:p>
+    <w:p>
+      <w:pPr>
+        <w:spacing w:after="40" w:before="140"/>
       </w:pPr>
       <w:r>
         <w:rPr>
           <w:b/>
           <w:bCs/>
         </w:rPr>
-        <w:t xml:space="preserve">Satzlänge und Absätze</w:t>
+        <w:t xml:space="preserve">4. Fachbegriffe</w:t>
+      </w:r>
+    </w:p>
+    <w:p>
+      <w:pPr>
+        <w:spacing w:after="50"/>
+      </w:pPr>
+      <w:r>
+        <w:t xml:space="preserve">[ ] immer mit Erklärung  [ ] nur bei Laien  [ ] nie erklären</w:t>
       </w:r>
     </w:p>
     <w:p>
@@ -906,41 +929,46 @@
           <w:sz w:val="19"/>
           <w:szCs w:val="19"/>
         </w:rPr>
-        <w:t xml:space="preserve">Eher kurze, knappe Sätze oder längere, erklärende? Wie lang dürfen Absätze sein? Gibt es einen typischen Einstieg?</w:t>
-      </w:r>
-    </w:p>
-    <w:p>
-      <w:pPr>
-        <w:pBdr>
-          <w:bottom w:val="single" w:color="D1D5D3" w:sz="2"/>
-        </w:pBdr>
-        <w:spacing w:after="120"/>
-      </w:pPr>
-      <w:r>
-        <w:t xml:space="preserve"/>
-      </w:r>
-    </w:p>
-    <w:p>
-      <w:pPr>
-        <w:pBdr>
-          <w:bottom w:val="single" w:color="D1D5D3" w:sz="2"/>
-        </w:pBdr>
-        <w:spacing w:after="120"/>
-      </w:pPr>
-      <w:r>
-        <w:t xml:space="preserve"/>
-      </w:r>
-    </w:p>
-    <w:p>
-      <w:pPr>
-        <w:spacing w:after="40" w:before="100"/>
+        <w:t xml:space="preserve">Welche Fachbegriffe sind erwünscht, welche braucht der Kunde als Ankerwort?</w:t>
+      </w:r>
+    </w:p>
+    <w:p>
+      <w:pPr>
+        <w:pBdr>
+          <w:bottom w:val="single" w:color="D1D5D3" w:sz="2"/>
+        </w:pBdr>
+        <w:spacing w:after="120"/>
+      </w:pPr>
+      <w:r>
+        <w:t xml:space="preserve"/>
+      </w:r>
+    </w:p>
+    <w:p>
+      <w:pPr>
+        <w:spacing w:after="50"/>
+      </w:pPr>
+      <w:r>
+        <w:t xml:space="preserve">Quelle:  [ ] im Workshop besprochen    [ ] aus dem Gespräch oder den Texten abgeleitet</w:t>
+      </w:r>
+    </w:p>
+    <w:p>
+      <w:pPr>
+        <w:spacing w:after="40" w:before="140"/>
       </w:pPr>
       <w:r>
         <w:rPr>
           <w:b/>
           <w:bCs/>
         </w:rPr>
-        <w:t xml:space="preserve">Hausvokabular</w:t>
+        <w:t xml:space="preserve">5. Zahlen und Typografie</w:t>
+      </w:r>
+    </w:p>
+    <w:p>
+      <w:pPr>
+        <w:spacing w:after="50"/>
+      </w:pPr>
+      <w:r>
+        <w:t xml:space="preserve">Zahlen: [ ] Ziffern  [ ] ausgeschrieben.  Anführungszeichen: [ ] «»  [ ] andere.  Fettdruck im Fliesstext: [ ] ja  [ ] nein.  Ausrufezeichen: [ ] nie  [ ] höchstens eines</w:t>
       </w:r>
     </w:p>
     <w:p>
@@ -953,41 +981,46 @@
           <w:sz w:val="19"/>
           <w:szCs w:val="19"/>
         </w:rPr>
-        <w:t xml:space="preserve">Welche Wörter und Begriffe verwendet die Marke gern und durchgehend (Produktnamen, Bezeichnungen für Kundschaft, Eigenwörter)?</w:t>
-      </w:r>
-    </w:p>
-    <w:p>
-      <w:pPr>
-        <w:pBdr>
-          <w:bottom w:val="single" w:color="D1D5D3" w:sz="2"/>
-        </w:pBdr>
-        <w:spacing w:after="120"/>
-      </w:pPr>
-      <w:r>
-        <w:t xml:space="preserve"/>
-      </w:r>
-    </w:p>
-    <w:p>
-      <w:pPr>
-        <w:pBdr>
-          <w:bottom w:val="single" w:color="D1D5D3" w:sz="2"/>
-        </w:pBdr>
-        <w:spacing w:after="120"/>
-      </w:pPr>
-      <w:r>
-        <w:t xml:space="preserve"/>
-      </w:r>
-    </w:p>
-    <w:p>
-      <w:pPr>
-        <w:spacing w:after="40" w:before="100"/>
+        <w:t xml:space="preserve">Schweizer Rechtschreibung (ss statt ß) gilt immer. Gendern: [ ] nein  [ ] Paarform  [ ] neutrale Formulierung.</w:t>
+      </w:r>
+    </w:p>
+    <w:p>
+      <w:pPr>
+        <w:pBdr>
+          <w:bottom w:val="single" w:color="D1D5D3" w:sz="2"/>
+        </w:pBdr>
+        <w:spacing w:after="120"/>
+      </w:pPr>
+      <w:r>
+        <w:t xml:space="preserve"/>
+      </w:r>
+    </w:p>
+    <w:p>
+      <w:pPr>
+        <w:spacing w:after="50"/>
+      </w:pPr>
+      <w:r>
+        <w:t xml:space="preserve">Quelle:  [ ] im Workshop besprochen    [ ] aus dem Gespräch oder den Texten abgeleitet</w:t>
+      </w:r>
+    </w:p>
+    <w:p>
+      <w:pPr>
+        <w:spacing w:after="40" w:before="140"/>
       </w:pPr>
       <w:r>
         <w:rPr>
           <w:b/>
           <w:bCs/>
         </w:rPr>
-        <w:t xml:space="preserve">Wörter und Wendungen, die nie vorkommen</w:t>
+        <w:t xml:space="preserve">6. Humor, Ironie, Emojis</w:t>
+      </w:r>
+    </w:p>
+    <w:p>
+      <w:pPr>
+        <w:spacing w:after="50"/>
+      </w:pPr>
+      <w:r>
+        <w:t xml:space="preserve">[ ] nie  [ ] nur in bestimmten Textarten: ____________</w:t>
       </w:r>
     </w:p>
     <w:p>
@@ -1000,41 +1033,46 @@
           <w:sz w:val="19"/>
           <w:szCs w:val="19"/>
         </w:rPr>
-        <w:t xml:space="preserve">Welche Formulierungen passen nicht zur Marke (zu förmlich, zu werblich, Modewörter)? Eine Verbotsliste in den Worten des Kunden.</w:t>
-      </w:r>
-    </w:p>
-    <w:p>
-      <w:pPr>
-        <w:pBdr>
-          <w:bottom w:val="single" w:color="D1D5D3" w:sz="2"/>
-        </w:pBdr>
-        <w:spacing w:after="120"/>
-      </w:pPr>
-      <w:r>
-        <w:t xml:space="preserve"/>
-      </w:r>
-    </w:p>
-    <w:p>
-      <w:pPr>
-        <w:pBdr>
-          <w:bottom w:val="single" w:color="D1D5D3" w:sz="2"/>
-        </w:pBdr>
-        <w:spacing w:after="120"/>
-      </w:pPr>
-      <w:r>
-        <w:t xml:space="preserve"/>
-      </w:r>
-    </w:p>
-    <w:p>
-      <w:pPr>
-        <w:spacing w:after="40" w:before="100"/>
+        <w:t xml:space="preserve">Wo ist eine Prise Leichtigkeit passend, wo nicht?</w:t>
+      </w:r>
+    </w:p>
+    <w:p>
+      <w:pPr>
+        <w:pBdr>
+          <w:bottom w:val="single" w:color="D1D5D3" w:sz="2"/>
+        </w:pBdr>
+        <w:spacing w:after="120"/>
+      </w:pPr>
+      <w:r>
+        <w:t xml:space="preserve"/>
+      </w:r>
+    </w:p>
+    <w:p>
+      <w:pPr>
+        <w:spacing w:after="50"/>
+      </w:pPr>
+      <w:r>
+        <w:t xml:space="preserve">Quelle:  [ ] im Workshop besprochen    [ ] aus dem Gespräch oder den Texten abgeleitet</w:t>
+      </w:r>
+    </w:p>
+    <w:p>
+      <w:pPr>
+        <w:spacing w:after="40" w:before="140"/>
       </w:pPr>
       <w:r>
         <w:rPr>
           <w:b/>
           <w:bCs/>
         </w:rPr>
-        <w:t xml:space="preserve">Fachbegriffe und Anglizismen</w:t>
+        <w:t xml:space="preserve">7. Feste Formeln</w:t>
+      </w:r>
+    </w:p>
+    <w:p>
+      <w:pPr>
+        <w:spacing w:after="50"/>
+      </w:pPr>
+      <w:r>
+        <w:t xml:space="preserve">Betreff, Einstieg, Gruss, Signatur: ____________</w:t>
       </w:r>
     </w:p>
     <w:p>
@@ -1047,41 +1085,46 @@
           <w:sz w:val="19"/>
           <w:szCs w:val="19"/>
         </w:rPr>
-        <w:t xml:space="preserve">Deutsch oder Englisch? Welche Fachbegriffe sind erwünscht, welche müssen erklärt werden?</w:t>
-      </w:r>
-    </w:p>
-    <w:p>
-      <w:pPr>
-        <w:pBdr>
-          <w:bottom w:val="single" w:color="D1D5D3" w:sz="2"/>
-        </w:pBdr>
-        <w:spacing w:after="120"/>
-      </w:pPr>
-      <w:r>
-        <w:t xml:space="preserve"/>
-      </w:r>
-    </w:p>
-    <w:p>
-      <w:pPr>
-        <w:pBdr>
-          <w:bottom w:val="single" w:color="D1D5D3" w:sz="2"/>
-        </w:pBdr>
-        <w:spacing w:after="120"/>
-      </w:pPr>
-      <w:r>
-        <w:t xml:space="preserve"/>
-      </w:r>
-    </w:p>
-    <w:p>
-      <w:pPr>
-        <w:spacing w:after="40" w:before="100"/>
+        <w:t xml:space="preserve">Gibt es Vorgaben, die immer gelten?</w:t>
+      </w:r>
+    </w:p>
+    <w:p>
+      <w:pPr>
+        <w:pBdr>
+          <w:bottom w:val="single" w:color="D1D5D3" w:sz="2"/>
+        </w:pBdr>
+        <w:spacing w:after="120"/>
+      </w:pPr>
+      <w:r>
+        <w:t xml:space="preserve"/>
+      </w:r>
+    </w:p>
+    <w:p>
+      <w:pPr>
+        <w:spacing w:after="50"/>
+      </w:pPr>
+      <w:r>
+        <w:t xml:space="preserve">Quelle:  [ ] im Workshop besprochen    [ ] aus dem Gespräch oder den Texten abgeleitet</w:t>
+      </w:r>
+    </w:p>
+    <w:p>
+      <w:pPr>
+        <w:spacing w:after="40" w:before="140"/>
       </w:pPr>
       <w:r>
         <w:rPr>
           <w:b/>
           <w:bCs/>
         </w:rPr>
-        <w:t xml:space="preserve">Humor, Ironie, Ausrufezeichen, Emojis</w:t>
+        <w:t xml:space="preserve">8. Rote Linien</w:t>
+      </w:r>
+    </w:p>
+    <w:p>
+      <w:pPr>
+        <w:spacing w:after="50"/>
+      </w:pPr>
+      <w:r>
+        <w:t xml:space="preserve">Themen, Aussagen und Versprechen, die nie vorkommen dürfen: ____________</w:t>
       </w:r>
     </w:p>
     <w:p>
@@ -1094,41 +1137,46 @@
           <w:sz w:val="19"/>
           <w:szCs w:val="19"/>
         </w:rPr>
-        <w:t xml:space="preserve">Was ist üblich, was nie? In welchen Textarten?</w:t>
-      </w:r>
-    </w:p>
-    <w:p>
-      <w:pPr>
-        <w:pBdr>
-          <w:bottom w:val="single" w:color="D1D5D3" w:sz="2"/>
-        </w:pBdr>
-        <w:spacing w:after="120"/>
-      </w:pPr>
-      <w:r>
-        <w:t xml:space="preserve"/>
-      </w:r>
-    </w:p>
-    <w:p>
-      <w:pPr>
-        <w:pBdr>
-          <w:bottom w:val="single" w:color="D1D5D3" w:sz="2"/>
-        </w:pBdr>
-        <w:spacing w:after="120"/>
-      </w:pPr>
-      <w:r>
-        <w:t xml:space="preserve"/>
-      </w:r>
-    </w:p>
-    <w:p>
-      <w:pPr>
-        <w:spacing w:after="40" w:before="100"/>
+        <w:t xml:space="preserve">Rechtlich, politisch, strategisch.</w:t>
+      </w:r>
+    </w:p>
+    <w:p>
+      <w:pPr>
+        <w:pBdr>
+          <w:bottom w:val="single" w:color="D1D5D3" w:sz="2"/>
+        </w:pBdr>
+        <w:spacing w:after="120"/>
+      </w:pPr>
+      <w:r>
+        <w:t xml:space="preserve"/>
+      </w:r>
+    </w:p>
+    <w:p>
+      <w:pPr>
+        <w:spacing w:after="50"/>
+      </w:pPr>
+      <w:r>
+        <w:t xml:space="preserve">Quelle:  [ ] im Workshop besprochen    [ ] aus dem Gespräch oder den Texten abgeleitet</w:t>
+      </w:r>
+    </w:p>
+    <w:p>
+      <w:pPr>
+        <w:spacing w:after="40" w:before="140"/>
       </w:pPr>
       <w:r>
         <w:rPr>
           <w:b/>
           <w:bCs/>
         </w:rPr>
-        <w:t xml:space="preserve">Schreibweise</w:t>
+        <w:t xml:space="preserve">9. Gesicherte Fakten</w:t>
+      </w:r>
+    </w:p>
+    <w:p>
+      <w:pPr>
+        <w:spacing w:after="50"/>
+      </w:pPr>
+      <w:r>
+        <w:t xml:space="preserve">Nur diese Angaben dürfen in Texten ohne Auftrag stehen: Gründungsjahr, Standorte, Zertifizierungen, Kennzahlen: ____________</w:t>
       </w:r>
     </w:p>
     <w:p>
@@ -1141,41 +1189,38 @@
           <w:sz w:val="19"/>
           <w:szCs w:val="19"/>
         </w:rPr>
-        <w:t xml:space="preserve">Schweizer Rechtschreibung (ss statt ß) ist Standard. Gendern: nein, mit Paarform, neutral formuliert? Zahlen, Datum, Währung?</w:t>
-      </w:r>
-    </w:p>
-    <w:p>
-      <w:pPr>
-        <w:pBdr>
-          <w:bottom w:val="single" w:color="D1D5D3" w:sz="2"/>
-        </w:pBdr>
-        <w:spacing w:after="120"/>
-      </w:pPr>
-      <w:r>
-        <w:t xml:space="preserve"/>
-      </w:r>
-    </w:p>
-    <w:p>
-      <w:pPr>
-        <w:pBdr>
-          <w:bottom w:val="single" w:color="D1D5D3" w:sz="2"/>
-        </w:pBdr>
-        <w:spacing w:after="120"/>
-      </w:pPr>
-      <w:r>
-        <w:t xml:space="preserve"/>
-      </w:r>
-    </w:p>
-    <w:p>
-      <w:pPr>
-        <w:spacing w:after="40" w:before="100"/>
+        <w:t xml:space="preserve">Alles andere kommt aus dem jeweiligen Auftrag. Beispielsätze in der Brand Voice enthalten Platzhalter statt Zahlen.</w:t>
+      </w:r>
+    </w:p>
+    <w:p>
+      <w:pPr>
+        <w:pBdr>
+          <w:bottom w:val="single" w:color="D1D5D3" w:sz="2"/>
+        </w:pBdr>
+        <w:spacing w:after="120"/>
+      </w:pPr>
+      <w:r>
+        <w:t xml:space="preserve"/>
+      </w:r>
+    </w:p>
+    <w:p>
+      <w:pPr>
+        <w:spacing w:after="50"/>
+      </w:pPr>
+      <w:r>
+        <w:t xml:space="preserve">Quelle:  [ ] im Workshop besprochen    [ ] aus dem Gespräch oder den Texten abgeleitet</w:t>
+      </w:r>
+    </w:p>
+    <w:p>
+      <w:pPr>
+        <w:spacing w:after="40" w:before="140"/>
       </w:pPr>
       <w:r>
         <w:rPr>
           <w:b/>
           <w:bCs/>
         </w:rPr>
-        <w:t xml:space="preserve">Feste Formeln</w:t>
+        <w:t xml:space="preserve">10. Stilmittel und Stil-Matrix je Textart</w:t>
       </w:r>
     </w:p>
     <w:p>
@@ -1188,125 +1233,945 @@
           <w:sz w:val="19"/>
           <w:szCs w:val="19"/>
         </w:rPr>
-        <w:t xml:space="preserve">Betreff, Einstiegssatz, Grussformel, Signatur: gibt es Vorgaben, die immer gelten?</w:t>
-      </w:r>
-    </w:p>
-    <w:p>
-      <w:pPr>
-        <w:pBdr>
-          <w:bottom w:val="single" w:color="D1D5D3" w:sz="2"/>
-        </w:pBdr>
-        <w:spacing w:after="120"/>
-      </w:pPr>
-      <w:r>
-        <w:t xml:space="preserve"/>
-      </w:r>
-    </w:p>
-    <w:p>
-      <w:pPr>
-        <w:pBdr>
-          <w:bottom w:val="single" w:color="D1D5D3" w:sz="2"/>
-        </w:pBdr>
-        <w:spacing w:after="120"/>
-      </w:pPr>
-      <w:r>
-        <w:t xml:space="preserve"/>
-      </w:r>
-    </w:p>
-    <w:p>
-      <w:pPr>
-        <w:spacing w:after="40" w:before="100"/>
-      </w:pPr>
-      <w:r>
-        <w:rPr>
-          <w:b/>
-          <w:bCs/>
-        </w:rPr>
-        <w:t xml:space="preserve">Rote Linien</w:t>
-      </w:r>
-    </w:p>
-    <w:p>
-      <w:pPr>
-        <w:spacing w:after="60"/>
-      </w:pPr>
-      <w:r>
-        <w:rPr>
-          <w:color w:val="5F6B63"/>
-          <w:sz w:val="19"/>
-          <w:szCs w:val="19"/>
-        </w:rPr>
-        <w:t xml:space="preserve">Themen, Aussagen oder Versprechen, die nie vorkommen dürfen (rechtlich, politisch, strategisch).</w:t>
-      </w:r>
-    </w:p>
-    <w:p>
-      <w:pPr>
-        <w:pBdr>
-          <w:bottom w:val="single" w:color="D1D5D3" w:sz="2"/>
-        </w:pBdr>
-        <w:spacing w:after="120"/>
-      </w:pPr>
-      <w:r>
-        <w:t xml:space="preserve"/>
-      </w:r>
-    </w:p>
-    <w:p>
-      <w:pPr>
-        <w:pBdr>
-          <w:bottom w:val="single" w:color="D1D5D3" w:sz="2"/>
-        </w:pBdr>
-        <w:spacing w:after="120"/>
-      </w:pPr>
-      <w:r>
-        <w:t xml:space="preserve"/>
-      </w:r>
-    </w:p>
-    <w:p>
-      <w:pPr>
-        <w:spacing w:after="40" w:before="100"/>
-      </w:pPr>
-      <w:r>
-        <w:rPr>
-          <w:b/>
-          <w:bCs/>
-        </w:rPr>
-        <w:t xml:space="preserve">Stilmittel der Marke (ankreuzen)</w:t>
-      </w:r>
-    </w:p>
-    <w:p>
-      <w:pPr>
-        <w:spacing w:after="60"/>
-      </w:pPr>
-      <w:r>
-        <w:t xml:space="preserve">[ ] Gegenüberstellungen «nicht X, sondern Y» sind Teil des Stils und erlaubt</w:t>
-      </w:r>
-    </w:p>
-    <w:p>
-      <w:pPr>
-        <w:spacing w:after="60"/>
-      </w:pPr>
-      <w:r>
-        <w:t xml:space="preserve">[ ] Dreierketten sind Teil des Stils und erlaubt</w:t>
-      </w:r>
-    </w:p>
-    <w:p>
-      <w:pPr>
-        <w:spacing w:after="60"/>
-      </w:pPr>
-      <w:r>
-        <w:t xml:space="preserve">[ ] Keines davon: streng nach den Standardregeln (Normalfall)</w:t>
-      </w:r>
-    </w:p>
-    <w:p>
-      <w:pPr>
-        <w:spacing w:after="140" w:before="60"/>
-      </w:pPr>
-      <w:r>
-        <w:rPr>
-          <w:i/>
-          <w:iCs/>
-          <w:color w:val="5F6B63"/>
-        </w:rPr>
-        <w:t xml:space="preserve">Gedankenstriche, Floskeln, ß und Markdown sind immer ausgeschlossen und werden nicht abgefragt.</w:t>
+        <w:t xml:space="preserve">Pro Textart ankreuzen oder eintragen. Dreierketten und Gegenüberstellungen («nicht X, sondern Y») sind nur dort erlaubt, wo sie ausdrücklich angekreuzt sind, höchstens einmal pro Text. Marketing (Webseite, LinkedIn) ist meist offener als geschäftliche Mails.</w:t>
+      </w:r>
+    </w:p>
+    <w:tbl>
+      <w:tblPr>
+        <w:tblW w:w="9600" w:type="dxa"/>
+        <w:tblBorders>
+          <w:top w:val="single" w:sz="4" w:space="0" w:color="CCCCCC"/>
+          <w:left w:val="single" w:sz="4" w:space="0" w:color="CCCCCC"/>
+          <w:bottom w:val="single" w:sz="4" w:space="0" w:color="CCCCCC"/>
+          <w:right w:val="single" w:sz="4" w:space="0" w:color="CCCCCC"/>
+          <w:insideH w:val="single" w:sz="4" w:space="0" w:color="CCCCCC"/>
+          <w:insideV w:val="single" w:sz="4" w:space="0" w:color="CCCCCC"/>
+        </w:tblBorders>
+        <w:tblLayout w:type="fixed"/>
+        <w:tblCellMar>
+          <w:top w:w="60" w:type="dxa"/>
+          <w:left w:w="100" w:type="dxa"/>
+          <w:bottom w:w="60" w:type="dxa"/>
+          <w:right w:w="100" w:type="dxa"/>
+        </w:tblCellMar>
+      </w:tblPr>
+      <w:tblGrid>
+        <w:gridCol w:w="1750"/>
+        <w:gridCol w:w="1100"/>
+        <w:gridCol w:w="1250"/>
+        <w:gridCol w:w="1500"/>
+        <w:gridCol w:w="1700"/>
+        <w:gridCol w:w="2300"/>
+      </w:tblGrid>
+      <w:tr>
+        <w:tc>
+          <w:tcPr>
+            <w:tcW w:w="1750" w:type="dxa"/>
+            <w:shd w:val="clear" w:color="auto" w:fill="EEF2EE"/>
+          </w:tcPr>
+          <w:p>
+            <w:pPr>
+              <w:spacing w:after="40"/>
+            </w:pPr>
+            <w:r>
+              <w:rPr>
+                <w:b/>
+                <w:sz w:val="18"/>
+              </w:rPr>
+              <w:t xml:space="preserve">Textart</w:t>
+            </w:r>
+          </w:p>
+        </w:tc>
+        <w:tc>
+          <w:tcPr>
+            <w:tcW w:w="1100" w:type="dxa"/>
+            <w:shd w:val="clear" w:color="auto" w:fill="EEF2EE"/>
+          </w:tcPr>
+          <w:p>
+            <w:pPr>
+              <w:spacing w:after="40"/>
+            </w:pPr>
+            <w:r>
+              <w:rPr>
+                <w:b/>
+                <w:sz w:val="18"/>
+              </w:rPr>
+              <w:t xml:space="preserve">Anrede</w:t>
+            </w:r>
+          </w:p>
+        </w:tc>
+        <w:tc>
+          <w:tcPr>
+            <w:tcW w:w="1250" w:type="dxa"/>
+            <w:shd w:val="clear" w:color="auto" w:fill="EEF2EE"/>
+          </w:tcPr>
+          <w:p>
+            <w:pPr>
+              <w:spacing w:after="40"/>
+            </w:pPr>
+            <w:r>
+              <w:rPr>
+                <w:b/>
+                <w:sz w:val="18"/>
+              </w:rPr>
+              <w:t xml:space="preserve">Satzlänge</w:t>
+            </w:r>
+          </w:p>
+        </w:tc>
+        <w:tc>
+          <w:tcPr>
+            <w:tcW w:w="1500" w:type="dxa"/>
+            <w:shd w:val="clear" w:color="auto" w:fill="EEF2EE"/>
+          </w:tcPr>
+          <w:p>
+            <w:pPr>
+              <w:spacing w:after="40"/>
+            </w:pPr>
+            <w:r>
+              <w:rPr>
+                <w:b/>
+                <w:sz w:val="18"/>
+              </w:rPr>
+              <w:t xml:space="preserve">Dreierketten</w:t>
+            </w:r>
+          </w:p>
+        </w:tc>
+        <w:tc>
+          <w:tcPr>
+            <w:tcW w:w="1700" w:type="dxa"/>
+            <w:shd w:val="clear" w:color="auto" w:fill="EEF2EE"/>
+          </w:tcPr>
+          <w:p>
+            <w:pPr>
+              <w:spacing w:after="40"/>
+            </w:pPr>
+            <w:r>
+              <w:rPr>
+                <w:b/>
+                <w:sz w:val="18"/>
+              </w:rPr>
+              <w:t xml:space="preserve">Gegenüberstellungen</w:t>
+            </w:r>
+          </w:p>
+        </w:tc>
+        <w:tc>
+          <w:tcPr>
+            <w:tcW w:w="2300" w:type="dxa"/>
+            <w:shd w:val="clear" w:color="auto" w:fill="EEF2EE"/>
+          </w:tcPr>
+          <w:p>
+            <w:pPr>
+              <w:spacing w:after="40"/>
+            </w:pPr>
+            <w:r>
+              <w:rPr>
+                <w:b/>
+                <w:sz w:val="18"/>
+              </w:rPr>
+              <w:t xml:space="preserve">Besonderes</w:t>
+            </w:r>
+          </w:p>
+        </w:tc>
+      </w:tr>
+      <w:tr>
+        <w:tc>
+          <w:tcPr>
+            <w:tcW w:w="1750" w:type="dxa"/>
+          </w:tcPr>
+          <w:p>
+            <w:pPr>
+              <w:spacing w:after="40"/>
+            </w:pPr>
+            <w:r>
+              <w:rPr>
+                <w:sz w:val="18"/>
+              </w:rPr>
+              <w:t xml:space="preserve">Mail an Kunden</w:t>
+            </w:r>
+          </w:p>
+        </w:tc>
+        <w:tc>
+          <w:tcPr>
+            <w:tcW w:w="1100" w:type="dxa"/>
+          </w:tcPr>
+          <w:p>
+            <w:pPr>
+              <w:spacing w:after="40"/>
+            </w:pPr>
+            <w:r>
+              <w:rPr>
+                <w:sz w:val="18"/>
+              </w:rPr>
+              <w:t xml:space="preserve">Sie / Du</w:t>
+            </w:r>
+          </w:p>
+        </w:tc>
+        <w:tc>
+          <w:tcPr>
+            <w:tcW w:w="1250" w:type="dxa"/>
+          </w:tcPr>
+          <w:p>
+            <w:pPr>
+              <w:spacing w:after="40"/>
+            </w:pPr>
+            <w:r>
+              <w:rPr>
+                <w:sz w:val="18"/>
+              </w:rPr>
+              <w:t xml:space="preserve">____ Wörter</w:t>
+            </w:r>
+          </w:p>
+        </w:tc>
+        <w:tc>
+          <w:tcPr>
+            <w:tcW w:w="1500" w:type="dxa"/>
+          </w:tcPr>
+          <w:p>
+            <w:pPr>
+              <w:spacing w:after="40"/>
+            </w:pPr>
+            <w:r>
+              <w:rPr>
+                <w:sz w:val="18"/>
+              </w:rPr>
+              <w:t xml:space="preserve">[ ] ja  [ ] nein</w:t>
+            </w:r>
+          </w:p>
+        </w:tc>
+        <w:tc>
+          <w:tcPr>
+            <w:tcW w:w="1700" w:type="dxa"/>
+          </w:tcPr>
+          <w:p>
+            <w:pPr>
+              <w:spacing w:after="40"/>
+            </w:pPr>
+            <w:r>
+              <w:rPr>
+                <w:sz w:val="18"/>
+              </w:rPr>
+              <w:t xml:space="preserve">[ ] ja  [ ] nein</w:t>
+            </w:r>
+          </w:p>
+        </w:tc>
+        <w:tc>
+          <w:tcPr>
+            <w:tcW w:w="2300" w:type="dxa"/>
+          </w:tcPr>
+          <w:p>
+            <w:pPr>
+              <w:spacing w:after="40"/>
+            </w:pPr>
+            <w:r>
+              <w:rPr>
+                <w:sz w:val="18"/>
+              </w:rPr>
+              <w:t xml:space="preserve"/>
+            </w:r>
+          </w:p>
+        </w:tc>
+      </w:tr>
+      <w:tr>
+        <w:tc>
+          <w:tcPr>
+            <w:tcW w:w="1750" w:type="dxa"/>
+          </w:tcPr>
+          <w:p>
+            <w:pPr>
+              <w:spacing w:after="40"/>
+            </w:pPr>
+            <w:r>
+              <w:rPr>
+                <w:sz w:val="18"/>
+              </w:rPr>
+              <w:t xml:space="preserve">Mail intern</w:t>
+            </w:r>
+          </w:p>
+        </w:tc>
+        <w:tc>
+          <w:tcPr>
+            <w:tcW w:w="1100" w:type="dxa"/>
+          </w:tcPr>
+          <w:p>
+            <w:pPr>
+              <w:spacing w:after="40"/>
+            </w:pPr>
+            <w:r>
+              <w:rPr>
+                <w:sz w:val="18"/>
+              </w:rPr>
+              <w:t xml:space="preserve">Sie / Du</w:t>
+            </w:r>
+          </w:p>
+        </w:tc>
+        <w:tc>
+          <w:tcPr>
+            <w:tcW w:w="1250" w:type="dxa"/>
+          </w:tcPr>
+          <w:p>
+            <w:pPr>
+              <w:spacing w:after="40"/>
+            </w:pPr>
+            <w:r>
+              <w:rPr>
+                <w:sz w:val="18"/>
+              </w:rPr>
+              <w:t xml:space="preserve">____ Wörter</w:t>
+            </w:r>
+          </w:p>
+        </w:tc>
+        <w:tc>
+          <w:tcPr>
+            <w:tcW w:w="1500" w:type="dxa"/>
+          </w:tcPr>
+          <w:p>
+            <w:pPr>
+              <w:spacing w:after="40"/>
+            </w:pPr>
+            <w:r>
+              <w:rPr>
+                <w:sz w:val="18"/>
+              </w:rPr>
+              <w:t xml:space="preserve">[ ] ja  [ ] nein</w:t>
+            </w:r>
+          </w:p>
+        </w:tc>
+        <w:tc>
+          <w:tcPr>
+            <w:tcW w:w="1700" w:type="dxa"/>
+          </w:tcPr>
+          <w:p>
+            <w:pPr>
+              <w:spacing w:after="40"/>
+            </w:pPr>
+            <w:r>
+              <w:rPr>
+                <w:sz w:val="18"/>
+              </w:rPr>
+              <w:t xml:space="preserve">[ ] ja  [ ] nein</w:t>
+            </w:r>
+          </w:p>
+        </w:tc>
+        <w:tc>
+          <w:tcPr>
+            <w:tcW w:w="2300" w:type="dxa"/>
+          </w:tcPr>
+          <w:p>
+            <w:pPr>
+              <w:spacing w:after="40"/>
+            </w:pPr>
+            <w:r>
+              <w:rPr>
+                <w:sz w:val="18"/>
+              </w:rPr>
+              <w:t xml:space="preserve"/>
+            </w:r>
+          </w:p>
+        </w:tc>
+      </w:tr>
+      <w:tr>
+        <w:tc>
+          <w:tcPr>
+            <w:tcW w:w="1750" w:type="dxa"/>
+          </w:tcPr>
+          <w:p>
+            <w:pPr>
+              <w:spacing w:after="40"/>
+            </w:pPr>
+            <w:r>
+              <w:rPr>
+                <w:sz w:val="18"/>
+              </w:rPr>
+              <w:t xml:space="preserve">LinkedIn</w:t>
+            </w:r>
+          </w:p>
+        </w:tc>
+        <w:tc>
+          <w:tcPr>
+            <w:tcW w:w="1100" w:type="dxa"/>
+          </w:tcPr>
+          <w:p>
+            <w:pPr>
+              <w:spacing w:after="40"/>
+            </w:pPr>
+            <w:r>
+              <w:rPr>
+                <w:sz w:val="18"/>
+              </w:rPr>
+              <w:t xml:space="preserve">Sie / Du</w:t>
+            </w:r>
+          </w:p>
+        </w:tc>
+        <w:tc>
+          <w:tcPr>
+            <w:tcW w:w="1250" w:type="dxa"/>
+          </w:tcPr>
+          <w:p>
+            <w:pPr>
+              <w:spacing w:after="40"/>
+            </w:pPr>
+            <w:r>
+              <w:rPr>
+                <w:sz w:val="18"/>
+              </w:rPr>
+              <w:t xml:space="preserve">____ Wörter</w:t>
+            </w:r>
+          </w:p>
+        </w:tc>
+        <w:tc>
+          <w:tcPr>
+            <w:tcW w:w="1500" w:type="dxa"/>
+          </w:tcPr>
+          <w:p>
+            <w:pPr>
+              <w:spacing w:after="40"/>
+            </w:pPr>
+            <w:r>
+              <w:rPr>
+                <w:sz w:val="18"/>
+              </w:rPr>
+              <w:t xml:space="preserve">[ ] ja  [ ] nein</w:t>
+            </w:r>
+          </w:p>
+        </w:tc>
+        <w:tc>
+          <w:tcPr>
+            <w:tcW w:w="1700" w:type="dxa"/>
+          </w:tcPr>
+          <w:p>
+            <w:pPr>
+              <w:spacing w:after="40"/>
+            </w:pPr>
+            <w:r>
+              <w:rPr>
+                <w:sz w:val="18"/>
+              </w:rPr>
+              <w:t xml:space="preserve">[ ] ja  [ ] nein</w:t>
+            </w:r>
+          </w:p>
+        </w:tc>
+        <w:tc>
+          <w:tcPr>
+            <w:tcW w:w="2300" w:type="dxa"/>
+          </w:tcPr>
+          <w:p>
+            <w:pPr>
+              <w:spacing w:after="40"/>
+            </w:pPr>
+            <w:r>
+              <w:rPr>
+                <w:sz w:val="18"/>
+              </w:rPr>
+              <w:t xml:space="preserve"/>
+            </w:r>
+          </w:p>
+        </w:tc>
+      </w:tr>
+      <w:tr>
+        <w:tc>
+          <w:tcPr>
+            <w:tcW w:w="1750" w:type="dxa"/>
+          </w:tcPr>
+          <w:p>
+            <w:pPr>
+              <w:spacing w:after="40"/>
+            </w:pPr>
+            <w:r>
+              <w:rPr>
+                <w:sz w:val="18"/>
+              </w:rPr>
+              <w:t xml:space="preserve">Newsletter</w:t>
+            </w:r>
+          </w:p>
+        </w:tc>
+        <w:tc>
+          <w:tcPr>
+            <w:tcW w:w="1100" w:type="dxa"/>
+          </w:tcPr>
+          <w:p>
+            <w:pPr>
+              <w:spacing w:after="40"/>
+            </w:pPr>
+            <w:r>
+              <w:rPr>
+                <w:sz w:val="18"/>
+              </w:rPr>
+              <w:t xml:space="preserve">Sie / Du</w:t>
+            </w:r>
+          </w:p>
+        </w:tc>
+        <w:tc>
+          <w:tcPr>
+            <w:tcW w:w="1250" w:type="dxa"/>
+          </w:tcPr>
+          <w:p>
+            <w:pPr>
+              <w:spacing w:after="40"/>
+            </w:pPr>
+            <w:r>
+              <w:rPr>
+                <w:sz w:val="18"/>
+              </w:rPr>
+              <w:t xml:space="preserve">____ Wörter</w:t>
+            </w:r>
+          </w:p>
+        </w:tc>
+        <w:tc>
+          <w:tcPr>
+            <w:tcW w:w="1500" w:type="dxa"/>
+          </w:tcPr>
+          <w:p>
+            <w:pPr>
+              <w:spacing w:after="40"/>
+            </w:pPr>
+            <w:r>
+              <w:rPr>
+                <w:sz w:val="18"/>
+              </w:rPr>
+              <w:t xml:space="preserve">[ ] ja  [ ] nein</w:t>
+            </w:r>
+          </w:p>
+        </w:tc>
+        <w:tc>
+          <w:tcPr>
+            <w:tcW w:w="1700" w:type="dxa"/>
+          </w:tcPr>
+          <w:p>
+            <w:pPr>
+              <w:spacing w:after="40"/>
+            </w:pPr>
+            <w:r>
+              <w:rPr>
+                <w:sz w:val="18"/>
+              </w:rPr>
+              <w:t xml:space="preserve">[ ] ja  [ ] nein</w:t>
+            </w:r>
+          </w:p>
+        </w:tc>
+        <w:tc>
+          <w:tcPr>
+            <w:tcW w:w="2300" w:type="dxa"/>
+          </w:tcPr>
+          <w:p>
+            <w:pPr>
+              <w:spacing w:after="40"/>
+            </w:pPr>
+            <w:r>
+              <w:rPr>
+                <w:sz w:val="18"/>
+              </w:rPr>
+              <w:t xml:space="preserve"/>
+            </w:r>
+          </w:p>
+        </w:tc>
+      </w:tr>
+      <w:tr>
+        <w:tc>
+          <w:tcPr>
+            <w:tcW w:w="1750" w:type="dxa"/>
+          </w:tcPr>
+          <w:p>
+            <w:pPr>
+              <w:spacing w:after="40"/>
+            </w:pPr>
+            <w:r>
+              <w:rPr>
+                <w:sz w:val="18"/>
+              </w:rPr>
+              <w:t xml:space="preserve">Webseite</w:t>
+            </w:r>
+          </w:p>
+        </w:tc>
+        <w:tc>
+          <w:tcPr>
+            <w:tcW w:w="1100" w:type="dxa"/>
+          </w:tcPr>
+          <w:p>
+            <w:pPr>
+              <w:spacing w:after="40"/>
+            </w:pPr>
+            <w:r>
+              <w:rPr>
+                <w:sz w:val="18"/>
+              </w:rPr>
+              <w:t xml:space="preserve">Sie / Du</w:t>
+            </w:r>
+          </w:p>
+        </w:tc>
+        <w:tc>
+          <w:tcPr>
+            <w:tcW w:w="1250" w:type="dxa"/>
+          </w:tcPr>
+          <w:p>
+            <w:pPr>
+              <w:spacing w:after="40"/>
+            </w:pPr>
+            <w:r>
+              <w:rPr>
+                <w:sz w:val="18"/>
+              </w:rPr>
+              <w:t xml:space="preserve">____ Wörter</w:t>
+            </w:r>
+          </w:p>
+        </w:tc>
+        <w:tc>
+          <w:tcPr>
+            <w:tcW w:w="1500" w:type="dxa"/>
+          </w:tcPr>
+          <w:p>
+            <w:pPr>
+              <w:spacing w:after="40"/>
+            </w:pPr>
+            <w:r>
+              <w:rPr>
+                <w:sz w:val="18"/>
+              </w:rPr>
+              <w:t xml:space="preserve">[ ] ja  [ ] nein</w:t>
+            </w:r>
+          </w:p>
+        </w:tc>
+        <w:tc>
+          <w:tcPr>
+            <w:tcW w:w="1700" w:type="dxa"/>
+          </w:tcPr>
+          <w:p>
+            <w:pPr>
+              <w:spacing w:after="40"/>
+            </w:pPr>
+            <w:r>
+              <w:rPr>
+                <w:sz w:val="18"/>
+              </w:rPr>
+              <w:t xml:space="preserve">[ ] ja  [ ] nein</w:t>
+            </w:r>
+          </w:p>
+        </w:tc>
+        <w:tc>
+          <w:tcPr>
+            <w:tcW w:w="2300" w:type="dxa"/>
+          </w:tcPr>
+          <w:p>
+            <w:pPr>
+              <w:spacing w:after="40"/>
+            </w:pPr>
+            <w:r>
+              <w:rPr>
+                <w:sz w:val="18"/>
+              </w:rPr>
+              <w:t xml:space="preserve"/>
+            </w:r>
+          </w:p>
+        </w:tc>
+      </w:tr>
+      <w:tr>
+        <w:tc>
+          <w:tcPr>
+            <w:tcW w:w="1750" w:type="dxa"/>
+          </w:tcPr>
+          <w:p>
+            <w:pPr>
+              <w:spacing w:after="40"/>
+            </w:pPr>
+            <w:r>
+              <w:rPr>
+                <w:sz w:val="18"/>
+              </w:rPr>
+              <w:t xml:space="preserve">Rede</w:t>
+            </w:r>
+          </w:p>
+        </w:tc>
+        <w:tc>
+          <w:tcPr>
+            <w:tcW w:w="1100" w:type="dxa"/>
+          </w:tcPr>
+          <w:p>
+            <w:pPr>
+              <w:spacing w:after="40"/>
+            </w:pPr>
+            <w:r>
+              <w:rPr>
+                <w:sz w:val="18"/>
+              </w:rPr>
+              <w:t xml:space="preserve">Sie / Du</w:t>
+            </w:r>
+          </w:p>
+        </w:tc>
+        <w:tc>
+          <w:tcPr>
+            <w:tcW w:w="1250" w:type="dxa"/>
+          </w:tcPr>
+          <w:p>
+            <w:pPr>
+              <w:spacing w:after="40"/>
+            </w:pPr>
+            <w:r>
+              <w:rPr>
+                <w:sz w:val="18"/>
+              </w:rPr>
+              <w:t xml:space="preserve">____ Wörter</w:t>
+            </w:r>
+          </w:p>
+        </w:tc>
+        <w:tc>
+          <w:tcPr>
+            <w:tcW w:w="1500" w:type="dxa"/>
+          </w:tcPr>
+          <w:p>
+            <w:pPr>
+              <w:spacing w:after="40"/>
+            </w:pPr>
+            <w:r>
+              <w:rPr>
+                <w:sz w:val="18"/>
+              </w:rPr>
+              <w:t xml:space="preserve">[ ] ja  [ ] nein</w:t>
+            </w:r>
+          </w:p>
+        </w:tc>
+        <w:tc>
+          <w:tcPr>
+            <w:tcW w:w="1700" w:type="dxa"/>
+          </w:tcPr>
+          <w:p>
+            <w:pPr>
+              <w:spacing w:after="40"/>
+            </w:pPr>
+            <w:r>
+              <w:rPr>
+                <w:sz w:val="18"/>
+              </w:rPr>
+              <w:t xml:space="preserve">[ ] ja  [ ] nein</w:t>
+            </w:r>
+          </w:p>
+        </w:tc>
+        <w:tc>
+          <w:tcPr>
+            <w:tcW w:w="2300" w:type="dxa"/>
+          </w:tcPr>
+          <w:p>
+            <w:pPr>
+              <w:spacing w:after="40"/>
+            </w:pPr>
+            <w:r>
+              <w:rPr>
+                <w:sz w:val="18"/>
+              </w:rPr>
+              <w:t xml:space="preserve"/>
+            </w:r>
+          </w:p>
+        </w:tc>
+      </w:tr>
+      <w:tr>
+        <w:tc>
+          <w:tcPr>
+            <w:tcW w:w="1750" w:type="dxa"/>
+          </w:tcPr>
+          <w:p>
+            <w:pPr>
+              <w:spacing w:after="40"/>
+            </w:pPr>
+            <w:r>
+              <w:rPr>
+                <w:sz w:val="18"/>
+              </w:rPr>
+              <w:t xml:space="preserve">Brief</w:t>
+            </w:r>
+          </w:p>
+        </w:tc>
+        <w:tc>
+          <w:tcPr>
+            <w:tcW w:w="1100" w:type="dxa"/>
+          </w:tcPr>
+          <w:p>
+            <w:pPr>
+              <w:spacing w:after="40"/>
+            </w:pPr>
+            <w:r>
+              <w:rPr>
+                <w:sz w:val="18"/>
+              </w:rPr>
+              <w:t xml:space="preserve">Sie / Du</w:t>
+            </w:r>
+          </w:p>
+        </w:tc>
+        <w:tc>
+          <w:tcPr>
+            <w:tcW w:w="1250" w:type="dxa"/>
+          </w:tcPr>
+          <w:p>
+            <w:pPr>
+              <w:spacing w:after="40"/>
+            </w:pPr>
+            <w:r>
+              <w:rPr>
+                <w:sz w:val="18"/>
+              </w:rPr>
+              <w:t xml:space="preserve">____ Wörter</w:t>
+            </w:r>
+          </w:p>
+        </w:tc>
+        <w:tc>
+          <w:tcPr>
+            <w:tcW w:w="1500" w:type="dxa"/>
+          </w:tcPr>
+          <w:p>
+            <w:pPr>
+              <w:spacing w:after="40"/>
+            </w:pPr>
+            <w:r>
+              <w:rPr>
+                <w:sz w:val="18"/>
+              </w:rPr>
+              <w:t xml:space="preserve">[ ] ja  [ ] nein</w:t>
+            </w:r>
+          </w:p>
+        </w:tc>
+        <w:tc>
+          <w:tcPr>
+            <w:tcW w:w="1700" w:type="dxa"/>
+          </w:tcPr>
+          <w:p>
+            <w:pPr>
+              <w:spacing w:after="40"/>
+            </w:pPr>
+            <w:r>
+              <w:rPr>
+                <w:sz w:val="18"/>
+              </w:rPr>
+              <w:t xml:space="preserve">[ ] ja  [ ] nein</w:t>
+            </w:r>
+          </w:p>
+        </w:tc>
+        <w:tc>
+          <w:tcPr>
+            <w:tcW w:w="2300" w:type="dxa"/>
+          </w:tcPr>
+          <w:p>
+            <w:pPr>
+              <w:spacing w:after="40"/>
+            </w:pPr>
+            <w:r>
+              <w:rPr>
+                <w:sz w:val="18"/>
+              </w:rPr>
+              <w:t xml:space="preserve"/>
+            </w:r>
+          </w:p>
+        </w:tc>
+      </w:tr>
+      <w:tr>
+        <w:tc>
+          <w:tcPr>
+            <w:tcW w:w="1750" w:type="dxa"/>
+          </w:tcPr>
+          <w:p>
+            <w:pPr>
+              <w:spacing w:after="40"/>
+            </w:pPr>
+            <w:r>
+              <w:rPr>
+                <w:sz w:val="18"/>
+              </w:rPr>
+              <w:t xml:space="preserve">Medien</w:t>
+            </w:r>
+          </w:p>
+        </w:tc>
+        <w:tc>
+          <w:tcPr>
+            <w:tcW w:w="1100" w:type="dxa"/>
+          </w:tcPr>
+          <w:p>
+            <w:pPr>
+              <w:spacing w:after="40"/>
+            </w:pPr>
+            <w:r>
+              <w:rPr>
+                <w:sz w:val="18"/>
+              </w:rPr>
+              <w:t xml:space="preserve">Sie / Du</w:t>
+            </w:r>
+          </w:p>
+        </w:tc>
+        <w:tc>
+          <w:tcPr>
+            <w:tcW w:w="1250" w:type="dxa"/>
+          </w:tcPr>
+          <w:p>
+            <w:pPr>
+              <w:spacing w:after="40"/>
+            </w:pPr>
+            <w:r>
+              <w:rPr>
+                <w:sz w:val="18"/>
+              </w:rPr>
+              <w:t xml:space="preserve">____ Wörter</w:t>
+            </w:r>
+          </w:p>
+        </w:tc>
+        <w:tc>
+          <w:tcPr>
+            <w:tcW w:w="1500" w:type="dxa"/>
+          </w:tcPr>
+          <w:p>
+            <w:pPr>
+              <w:spacing w:after="40"/>
+            </w:pPr>
+            <w:r>
+              <w:rPr>
+                <w:sz w:val="18"/>
+              </w:rPr>
+              <w:t xml:space="preserve">[ ] ja  [ ] nein</w:t>
+            </w:r>
+          </w:p>
+        </w:tc>
+        <w:tc>
+          <w:tcPr>
+            <w:tcW w:w="1700" w:type="dxa"/>
+          </w:tcPr>
+          <w:p>
+            <w:pPr>
+              <w:spacing w:after="40"/>
+            </w:pPr>
+            <w:r>
+              <w:rPr>
+                <w:sz w:val="18"/>
+              </w:rPr>
+              <w:t xml:space="preserve">[ ] ja  [ ] nein</w:t>
+            </w:r>
+          </w:p>
+        </w:tc>
+        <w:tc>
+          <w:tcPr>
+            <w:tcW w:w="2300" w:type="dxa"/>
+          </w:tcPr>
+          <w:p>
+            <w:pPr>
+              <w:spacing w:after="40"/>
+            </w:pPr>
+            <w:r>
+              <w:rPr>
+                <w:sz w:val="18"/>
+              </w:rPr>
+              <w:t xml:space="preserve"/>
+            </w:r>
+          </w:p>
+        </w:tc>
+      </w:tr>
+    </w:tbl>
+    <w:p>
+      <w:pPr>
+        <w:spacing w:after="120"/>
+      </w:pPr>
+      <w:r>
+        <w:t xml:space="preserve"/>
+      </w:r>
+    </w:p>
+    <w:p>
+      <w:pPr>
+        <w:spacing w:after="50"/>
+      </w:pPr>
+      <w:r>
+        <w:t xml:space="preserve">Eintrag in die Brand Voice (macht die Analyse aus diesen Antworten): «Stilmittel erlaubt: Dreierketten (Webseite, LinkedIn); Gegenüberstellungen (Webseite)». Ohne Eintrag gilt die strenge Linie.</w:t>
       </w:r>
     </w:p>
     <w:p>

</xml_diff>